<commit_message>
Document MicroSD module alternative for SPI storage
- Add MicroSD module wiring details (same SPI pins + 3.3V/GND) to README.md
- Note space-saving advantage in enclosure by omitting full-size SD on TFT
- Add reference comment in esp32-s3-devkit config.h
- Update hardware documentation docx
</commit_message>
<xml_diff>
--- a/Retro go mit esp32s3 R16N8.docx
+++ b/Retro go mit esp32s3 R16N8.docx
@@ -461,6 +461,9 @@
     <w:p/>
     <w:p>
       <w:r>
+        <w:t>#</w:t>
+      </w:r>
+      <w:r>
         <w:t xml:space="preserve">TFT muss </w:t>
       </w:r>
       <w:proofErr w:type="spellStart"/>
@@ -497,6 +500,27 @@
       </w:r>
     </w:p>
     <w:p>
+      <w:r>
+        <w:t xml:space="preserve">Separates </w:t>
+      </w:r>
+      <w:proofErr w:type="gramStart"/>
+      <w:r>
+        <w:t>SD Card</w:t>
+      </w:r>
+      <w:proofErr w:type="gramEnd"/>
+      <w:r>
+        <w:t xml:space="preserve"> Modul – </w:t>
+      </w:r>
+      <w:proofErr w:type="spellStart"/>
+      <w:r>
+        <w:t>diesselbe</w:t>
+      </w:r>
+      <w:proofErr w:type="spellEnd"/>
+      <w:r>
+        <w:t xml:space="preserve"> Beschaltung zusätzlich 3,3V und GND </w:t>
+      </w:r>
+    </w:p>
+    <w:p>
       <w:pPr>
         <w:rPr>
           <w:b/>
@@ -571,6 +595,7 @@
           <w:b/>
           <w:bCs/>
         </w:rPr>
+        <w:lastRenderedPageBreak/>
         <w:t>#define RG_STORAGE_SDSPI_HOST       SPI3_HOST</w:t>
       </w:r>
     </w:p>
@@ -586,7 +611,6 @@
           <w:b/>
           <w:bCs/>
         </w:rPr>
-        <w:lastRenderedPageBreak/>
         <w:t>#define RG_STORAGE_SDSPI_SPEED      SDMMC_FREQ_DEFAULT</w:t>
       </w:r>
     </w:p>
@@ -596,10 +620,21 @@
       </w:r>
     </w:p>
     <w:p>
-      <w:r>
+      <w:pPr>
+        <w:rPr>
+          <w:strike/>
+        </w:rPr>
+      </w:pPr>
+      <w:r>
+        <w:rPr>
+          <w:strike/>
+        </w:rPr>
         <w:t>SD-Modul Pin</w:t>
       </w:r>
       <w:r>
+        <w:rPr>
+          <w:strike/>
+        </w:rPr>
         <w:tab/>
         <w:t>ESP32-S3 GPIO über ili9341 hinten</w:t>
       </w:r>

</xml_diff>